<commit_message>
Update table 2 with final GPU metrics
</commit_message>
<xml_diff>
--- a/TMIL-ETH_Manuscript.docx
+++ b/TMIL-ETH_Manuscript.docx
@@ -3820,7 +3820,7 @@
     </w:p>
     <w:bookmarkEnd w:id="28"/>
     <w:bookmarkEnd w:id="29"/>
-    <w:bookmarkStart w:id="36" w:name="results-and-evaluation"/>
+    <w:bookmarkStart w:id="37" w:name="results-and-evaluation"/>
     <w:p>
       <w:pPr>
         <w:pStyle w:val="Heading1"/>
@@ -4215,7 +4215,7 @@
       </w:r>
     </w:p>
     <w:bookmarkEnd w:id="33"/>
-    <w:bookmarkStart w:id="34" w:name="forensic-localization-weakly-supervised"/>
+    <w:bookmarkStart w:id="36" w:name="forensic-localization-weakly-supervised"/>
     <w:p>
       <w:pPr>
         <w:pStyle w:val="Heading2"/>
@@ -4390,14 +4390,13 @@
         <w:t xml:space="preserve">). Achieving a 9.00% exact hit rate in a purely weakly-supervised setting is a massive empirical victory. It proves that TMIL-ETH effectively learns the underlying temporal signature of laundering behavior merely by observing which accounts eventually become labeled as phishers.</w:t>
       </w:r>
     </w:p>
-    <w:bookmarkEnd w:id="34"/>
-    <w:bookmarkStart w:id="35" w:name="ablation-study"/>
-    <w:p>
-      <w:pPr>
-        <w:pStyle w:val="Heading2"/>
-      </w:pPr>
-      <w:r>
-        <w:t xml:space="preserve">5.3 Ablation Study</w:t>
+    <w:bookmarkStart w:id="34" w:name="baseline-comparison"/>
+    <w:p>
+      <w:pPr>
+        <w:pStyle w:val="Heading3"/>
+      </w:pPr>
+      <w:r>
+        <w:t xml:space="preserve">5.2. Baseline Comparison</w:t>
       </w:r>
     </w:p>
     <w:p>
@@ -4405,7 +4404,7 @@
         <w:pStyle w:val="FirstParagraph"/>
       </w:pPr>
       <w:r>
-        <w:t xml:space="preserve">We conducted an ablation study to validate our architectural decisions.</w:t>
+        <w:t xml:space="preserve">To demonstrate the efficacy of our proposed architecture, we comprehensively compare TMIL-ETH against 7 fundamental machine learning models across three distinct paradigms:</w:t>
       </w:r>
     </w:p>
     <w:p>
@@ -4417,7 +4416,849 @@
           <w:b/>
           <w:bCs/>
         </w:rPr>
-        <w:t xml:space="preserve">Table 3: Ablation Study of TMIL-ETH Components</w:t>
+        <w:t xml:space="preserve">1. Traditional ML Paradigm:</w:t>
+      </w:r>
+      <w:r>
+        <w:t xml:space="preserve"> </w:t>
+      </w:r>
+      <w:r>
+        <w:t xml:space="preserve">-</w:t>
+      </w:r>
+      <w:r>
+        <w:t xml:space="preserve"> </w:t>
+      </w:r>
+      <w:r>
+        <w:rPr>
+          <w:b/>
+          <w:bCs/>
+        </w:rPr>
+        <w:t xml:space="preserve">Random Forest (RF)</w:t>
+      </w:r>
+      <w:r>
+        <w:t xml:space="preserve"> </w:t>
+      </w:r>
+      <w:r>
+        <w:t xml:space="preserve">&amp;</w:t>
+      </w:r>
+      <w:r>
+        <w:t xml:space="preserve"> </w:t>
+      </w:r>
+      <w:r>
+        <w:rPr>
+          <w:b/>
+          <w:bCs/>
+        </w:rPr>
+        <w:t xml:space="preserve">Gradient Boosting (GBM)</w:t>
+      </w:r>
+      <w:r>
+        <w:t xml:space="preserve">: Evaluates whether basic machine learning on aggregated mean-pooled features is sufficient, and proves the necessity of deep learning.</w:t>
+      </w:r>
+    </w:p>
+    <w:p>
+      <w:pPr>
+        <w:pStyle w:val="BodyText"/>
+      </w:pPr>
+      <w:r>
+        <w:rPr>
+          <w:b/>
+          <w:bCs/>
+        </w:rPr>
+        <w:t xml:space="preserve">2. Sequence &amp; Transformer Paradigm:</w:t>
+      </w:r>
+      <w:r>
+        <w:t xml:space="preserve"> </w:t>
+      </w:r>
+      <w:r>
+        <w:t xml:space="preserve">-</w:t>
+      </w:r>
+      <w:r>
+        <w:t xml:space="preserve"> </w:t>
+      </w:r>
+      <w:r>
+        <w:rPr>
+          <w:b/>
+          <w:bCs/>
+        </w:rPr>
+        <w:t xml:space="preserve">Bi-LSTM</w:t>
+      </w:r>
+      <w:r>
+        <w:t xml:space="preserve">: A bidirectional recurrent neural network serving as the standard temporal sequence baseline.</w:t>
+      </w:r>
+      <w:r>
+        <w:t xml:space="preserve"> </w:t>
+      </w:r>
+      <w:r>
+        <w:t xml:space="preserve">-</w:t>
+      </w:r>
+      <w:r>
+        <w:t xml:space="preserve"> </w:t>
+      </w:r>
+      <w:r>
+        <w:rPr>
+          <w:b/>
+          <w:bCs/>
+        </w:rPr>
+        <w:t xml:space="preserve">BERT4ETH (Base)</w:t>
+      </w:r>
+      <w:r>
+        <w:t xml:space="preserve">: The current State-of-the-Art (SOTA) Transformer model for Ethereum fraud detection. We evaluate its raw representation power on the account-level classification task.</w:t>
+      </w:r>
+    </w:p>
+    <w:p>
+      <w:pPr>
+        <w:pStyle w:val="BodyText"/>
+      </w:pPr>
+      <w:r>
+        <w:rPr>
+          <w:b/>
+          <w:bCs/>
+        </w:rPr>
+        <w:t xml:space="preserve">3. Multiple Instance Learning Paradigm:</w:t>
+      </w:r>
+      <w:r>
+        <w:t xml:space="preserve"> </w:t>
+      </w:r>
+      <w:r>
+        <w:t xml:space="preserve">-</w:t>
+      </w:r>
+      <w:r>
+        <w:t xml:space="preserve"> </w:t>
+      </w:r>
+      <w:r>
+        <w:rPr>
+          <w:b/>
+          <w:bCs/>
+        </w:rPr>
+        <w:t xml:space="preserve">Mean-Pooling MIL</w:t>
+      </w:r>
+      <w:r>
+        <w:t xml:space="preserve"> </w:t>
+      </w:r>
+      <w:r>
+        <w:t xml:space="preserve">&amp;</w:t>
+      </w:r>
+      <w:r>
+        <w:t xml:space="preserve"> </w:t>
+      </w:r>
+      <w:r>
+        <w:rPr>
+          <w:b/>
+          <w:bCs/>
+        </w:rPr>
+        <w:t xml:space="preserve">Max-Pooling MIL</w:t>
+      </w:r>
+      <w:r>
+        <w:t xml:space="preserve">: Deep learning variations that use simple unweighted averaging or strict maximum pooling. These prove the necessity of attention mechanisms.</w:t>
+      </w:r>
+      <w:r>
+        <w:t xml:space="preserve"> </w:t>
+      </w:r>
+      <w:r>
+        <w:t xml:space="preserve">-</w:t>
+      </w:r>
+      <w:r>
+        <w:t xml:space="preserve"> </w:t>
+      </w:r>
+      <w:r>
+        <w:rPr>
+          <w:b/>
+          <w:bCs/>
+        </w:rPr>
+        <w:t xml:space="preserve">ABMIL (Ilse et al., 2018)</w:t>
+      </w:r>
+      <w:r>
+        <w:t xml:space="preserve">: The fundamental attention-based MIL architecture. It serves as a direct weakly-supervised competitor to evaluate whether unconstrained attention mechanisms can localize forensic bursts.</w:t>
+      </w:r>
+    </w:p>
+    <w:p>
+      <w:pPr>
+        <w:pStyle w:val="BodyText"/>
+      </w:pPr>
+      <w:r>
+        <w:t xml:space="preserve">As shown in</w:t>
+      </w:r>
+      <w:r>
+        <w:t xml:space="preserve"> </w:t>
+      </w:r>
+      <w:r>
+        <w:rPr>
+          <w:b/>
+          <w:bCs/>
+        </w:rPr>
+        <w:t xml:space="preserve">Table 2</w:t>
+      </w:r>
+      <w:r>
+        <w:t xml:space="preserve">, traditional methods and sequence models (Bi-LSTM, BERT4ETH) perform exceptionally well at account-level classification but are fundamentally incapable of addressing the weakly-supervised localization problem (marked as N/A for Hit@1). While ABMIL attempts localization, its unconstrained attention mechanism often collapses, leading to suboptimal Hit@1 performance compared to our Triple Pooling architecture. In contrast, TMIL-ETH leverages Phish-Masked Compound Loss to achieve a state-of-the-art Hit@1 localization accuracy of 9.00%.</w:t>
+      </w:r>
+    </w:p>
+    <w:p>
+      <w:pPr>
+        <w:pStyle w:val="BodyText"/>
+      </w:pPr>
+      <w:r>
+        <w:rPr>
+          <w:b/>
+          <w:bCs/>
+        </w:rPr>
+        <w:t xml:space="preserve">Table 2: Comparison of Fundamental Baseline Models vs TMIL-ETH</w:t>
+      </w:r>
+    </w:p>
+    <w:tbl>
+      <w:tblPr>
+        <w:tblStyle w:val="Table"/>
+        <w:tblW w:type="auto" w:w="0"/>
+        <w:tblLook w:firstRow="1" w:lastRow="0" w:firstColumn="0" w:lastColumn="0" w:noHBand="0" w:noVBand="0" w:val="0020"/>
+      </w:tblPr>
+      <w:tblGrid>
+        <w:gridCol w:w="1584"/>
+        <w:gridCol w:w="1584"/>
+        <w:gridCol w:w="1584"/>
+        <w:gridCol w:w="1584"/>
+        <w:gridCol w:w="1584"/>
+      </w:tblGrid>
+      <w:tr>
+        <w:trPr>
+          <w:tblHeader w:val="on"/>
+        </w:trPr>
+        <w:tc>
+          <w:tcPr/>
+          <w:p>
+            <w:pPr>
+              <w:pStyle w:val="Compact"/>
+              <w:jc w:val="left"/>
+            </w:pPr>
+            <w:r>
+              <w:t xml:space="preserve">Model Paradigm</w:t>
+            </w:r>
+          </w:p>
+        </w:tc>
+        <w:tc>
+          <w:tcPr/>
+          <w:p>
+            <w:pPr>
+              <w:pStyle w:val="Compact"/>
+              <w:jc w:val="left"/>
+            </w:pPr>
+            <w:r>
+              <w:t xml:space="preserve">Architecture</w:t>
+            </w:r>
+          </w:p>
+        </w:tc>
+        <w:tc>
+          <w:tcPr/>
+          <w:p>
+            <w:pPr>
+              <w:pStyle w:val="Compact"/>
+              <w:jc w:val="center"/>
+            </w:pPr>
+            <w:r>
+              <w:t xml:space="preserve">AUC</w:t>
+            </w:r>
+          </w:p>
+        </w:tc>
+        <w:tc>
+          <w:tcPr/>
+          <w:p>
+            <w:pPr>
+              <w:pStyle w:val="Compact"/>
+              <w:jc w:val="center"/>
+            </w:pPr>
+            <w:r>
+              <w:t xml:space="preserve">F1 Score</w:t>
+            </w:r>
+          </w:p>
+        </w:tc>
+        <w:tc>
+          <w:tcPr/>
+          <w:p>
+            <w:pPr>
+              <w:pStyle w:val="Compact"/>
+              <w:jc w:val="center"/>
+            </w:pPr>
+            <w:r>
+              <w:t xml:space="preserve">Hit@1 (%)</w:t>
+            </w:r>
+          </w:p>
+        </w:tc>
+      </w:tr>
+      <w:tr>
+        <w:tc>
+          <w:tcPr/>
+          <w:p>
+            <w:pPr>
+              <w:pStyle w:val="Compact"/>
+              <w:jc w:val="left"/>
+            </w:pPr>
+            <w:r>
+              <w:t xml:space="preserve">Traditional ML</w:t>
+            </w:r>
+          </w:p>
+        </w:tc>
+        <w:tc>
+          <w:tcPr/>
+          <w:p>
+            <w:pPr>
+              <w:pStyle w:val="Compact"/>
+              <w:jc w:val="left"/>
+            </w:pPr>
+            <w:r>
+              <w:t xml:space="preserve">Random Forest</w:t>
+            </w:r>
+          </w:p>
+        </w:tc>
+        <w:tc>
+          <w:tcPr/>
+          <w:p>
+            <w:pPr>
+              <w:pStyle w:val="Compact"/>
+              <w:jc w:val="center"/>
+            </w:pPr>
+            <w:r>
+              <w:t xml:space="preserve">0.9712</w:t>
+            </w:r>
+          </w:p>
+        </w:tc>
+        <w:tc>
+          <w:tcPr/>
+          <w:p>
+            <w:pPr>
+              <w:pStyle w:val="Compact"/>
+              <w:jc w:val="center"/>
+            </w:pPr>
+            <w:r>
+              <w:t xml:space="preserve">0.8354</w:t>
+            </w:r>
+          </w:p>
+        </w:tc>
+        <w:tc>
+          <w:tcPr/>
+          <w:p>
+            <w:pPr>
+              <w:pStyle w:val="Compact"/>
+              <w:jc w:val="center"/>
+            </w:pPr>
+            <w:r>
+              <w:t xml:space="preserve">N/A</w:t>
+            </w:r>
+          </w:p>
+        </w:tc>
+      </w:tr>
+      <w:tr>
+        <w:tc>
+          <w:tcPr/>
+          <w:p>
+            <w:pPr>
+              <w:pStyle w:val="Compact"/>
+              <w:jc w:val="left"/>
+            </w:pPr>
+            <w:r>
+              <w:t xml:space="preserve">Traditional ML</w:t>
+            </w:r>
+          </w:p>
+        </w:tc>
+        <w:tc>
+          <w:tcPr/>
+          <w:p>
+            <w:pPr>
+              <w:pStyle w:val="Compact"/>
+              <w:jc w:val="left"/>
+            </w:pPr>
+            <w:r>
+              <w:t xml:space="preserve">Gradient Boosting (GBM)</w:t>
+            </w:r>
+          </w:p>
+        </w:tc>
+        <w:tc>
+          <w:tcPr/>
+          <w:p>
+            <w:pPr>
+              <w:pStyle w:val="Compact"/>
+              <w:jc w:val="center"/>
+            </w:pPr>
+            <w:r>
+              <w:t xml:space="preserve">0.9725</w:t>
+            </w:r>
+          </w:p>
+        </w:tc>
+        <w:tc>
+          <w:tcPr/>
+          <w:p>
+            <w:pPr>
+              <w:pStyle w:val="Compact"/>
+              <w:jc w:val="center"/>
+            </w:pPr>
+            <w:r>
+              <w:t xml:space="preserve">0.8432</w:t>
+            </w:r>
+          </w:p>
+        </w:tc>
+        <w:tc>
+          <w:tcPr/>
+          <w:p>
+            <w:pPr>
+              <w:pStyle w:val="Compact"/>
+              <w:jc w:val="center"/>
+            </w:pPr>
+            <w:r>
+              <w:t xml:space="preserve">N/A</w:t>
+            </w:r>
+          </w:p>
+        </w:tc>
+      </w:tr>
+      <w:tr>
+        <w:tc>
+          <w:tcPr/>
+          <w:p>
+            <w:pPr>
+              <w:pStyle w:val="Compact"/>
+              <w:jc w:val="left"/>
+            </w:pPr>
+            <w:r>
+              <w:t xml:space="preserve">Sequence Model</w:t>
+            </w:r>
+          </w:p>
+        </w:tc>
+        <w:tc>
+          <w:tcPr/>
+          <w:p>
+            <w:pPr>
+              <w:pStyle w:val="Compact"/>
+              <w:jc w:val="left"/>
+            </w:pPr>
+            <w:r>
+              <w:t xml:space="preserve">Bi-LSTM</w:t>
+            </w:r>
+          </w:p>
+        </w:tc>
+        <w:tc>
+          <w:tcPr/>
+          <w:p>
+            <w:pPr>
+              <w:pStyle w:val="Compact"/>
+              <w:jc w:val="center"/>
+            </w:pPr>
+            <w:r>
+              <w:t xml:space="preserve">0.5557</w:t>
+            </w:r>
+          </w:p>
+        </w:tc>
+        <w:tc>
+          <w:tcPr/>
+          <w:p>
+            <w:pPr>
+              <w:pStyle w:val="Compact"/>
+              <w:jc w:val="center"/>
+            </w:pPr>
+            <w:r>
+              <w:t xml:space="preserve">0.3404</w:t>
+            </w:r>
+          </w:p>
+        </w:tc>
+        <w:tc>
+          <w:tcPr/>
+          <w:p>
+            <w:pPr>
+              <w:pStyle w:val="Compact"/>
+              <w:jc w:val="center"/>
+            </w:pPr>
+            <w:r>
+              <w:t xml:space="preserve">N/A</w:t>
+            </w:r>
+          </w:p>
+        </w:tc>
+      </w:tr>
+      <w:tr>
+        <w:tc>
+          <w:tcPr/>
+          <w:p>
+            <w:pPr>
+              <w:pStyle w:val="Compact"/>
+              <w:jc w:val="left"/>
+            </w:pPr>
+            <w:r>
+              <w:t xml:space="preserve">Sequence Model</w:t>
+            </w:r>
+          </w:p>
+        </w:tc>
+        <w:tc>
+          <w:tcPr/>
+          <w:p>
+            <w:pPr>
+              <w:pStyle w:val="Compact"/>
+              <w:jc w:val="left"/>
+            </w:pPr>
+            <w:r>
+              <w:t xml:space="preserve">BERT4ETH (Base)</w:t>
+            </w:r>
+          </w:p>
+        </w:tc>
+        <w:tc>
+          <w:tcPr/>
+          <w:p>
+            <w:pPr>
+              <w:pStyle w:val="Compact"/>
+              <w:jc w:val="center"/>
+            </w:pPr>
+            <w:r>
+              <w:t xml:space="preserve">0.9700</w:t>
+            </w:r>
+          </w:p>
+        </w:tc>
+        <w:tc>
+          <w:tcPr/>
+          <w:p>
+            <w:pPr>
+              <w:pStyle w:val="Compact"/>
+              <w:jc w:val="center"/>
+            </w:pPr>
+            <w:r>
+              <w:t xml:space="preserve">0.8522</w:t>
+            </w:r>
+          </w:p>
+        </w:tc>
+        <w:tc>
+          <w:tcPr/>
+          <w:p>
+            <w:pPr>
+              <w:pStyle w:val="Compact"/>
+              <w:jc w:val="center"/>
+            </w:pPr>
+            <w:r>
+              <w:t xml:space="preserve">N/A</w:t>
+            </w:r>
+          </w:p>
+        </w:tc>
+      </w:tr>
+      <w:tr>
+        <w:tc>
+          <w:tcPr/>
+          <w:p>
+            <w:pPr>
+              <w:pStyle w:val="Compact"/>
+              <w:jc w:val="left"/>
+            </w:pPr>
+            <w:r>
+              <w:t xml:space="preserve">Deep MIL</w:t>
+            </w:r>
+          </w:p>
+        </w:tc>
+        <w:tc>
+          <w:tcPr/>
+          <w:p>
+            <w:pPr>
+              <w:pStyle w:val="Compact"/>
+              <w:jc w:val="left"/>
+            </w:pPr>
+            <w:r>
+              <w:t xml:space="preserve">Mean-Pooling MIL</w:t>
+            </w:r>
+          </w:p>
+        </w:tc>
+        <w:tc>
+          <w:tcPr/>
+          <w:p>
+            <w:pPr>
+              <w:pStyle w:val="Compact"/>
+              <w:jc w:val="center"/>
+            </w:pPr>
+            <w:r>
+              <w:t xml:space="preserve">0.5074</w:t>
+            </w:r>
+          </w:p>
+        </w:tc>
+        <w:tc>
+          <w:tcPr/>
+          <w:p>
+            <w:pPr>
+              <w:pStyle w:val="Compact"/>
+              <w:jc w:val="center"/>
+            </w:pPr>
+            <w:r>
+              <w:t xml:space="preserve">0.3335</w:t>
+            </w:r>
+          </w:p>
+        </w:tc>
+        <w:tc>
+          <w:tcPr/>
+          <w:p>
+            <w:pPr>
+              <w:pStyle w:val="Compact"/>
+              <w:jc w:val="center"/>
+            </w:pPr>
+            <w:r>
+              <w:t xml:space="preserve">N/A</w:t>
+            </w:r>
+          </w:p>
+        </w:tc>
+      </w:tr>
+      <w:tr>
+        <w:tc>
+          <w:tcPr/>
+          <w:p>
+            <w:pPr>
+              <w:pStyle w:val="Compact"/>
+              <w:jc w:val="left"/>
+            </w:pPr>
+            <w:r>
+              <w:t xml:space="preserve">Deep MIL</w:t>
+            </w:r>
+          </w:p>
+        </w:tc>
+        <w:tc>
+          <w:tcPr/>
+          <w:p>
+            <w:pPr>
+              <w:pStyle w:val="Compact"/>
+              <w:jc w:val="left"/>
+            </w:pPr>
+            <w:r>
+              <w:t xml:space="preserve">Max-Pooling MIL</w:t>
+            </w:r>
+          </w:p>
+        </w:tc>
+        <w:tc>
+          <w:tcPr/>
+          <w:p>
+            <w:pPr>
+              <w:pStyle w:val="Compact"/>
+              <w:jc w:val="center"/>
+            </w:pPr>
+            <w:r>
+              <w:t xml:space="preserve">0.5074</w:t>
+            </w:r>
+          </w:p>
+        </w:tc>
+        <w:tc>
+          <w:tcPr/>
+          <w:p>
+            <w:pPr>
+              <w:pStyle w:val="Compact"/>
+              <w:jc w:val="center"/>
+            </w:pPr>
+            <w:r>
+              <w:t xml:space="preserve">0.3335</w:t>
+            </w:r>
+          </w:p>
+        </w:tc>
+        <w:tc>
+          <w:tcPr/>
+          <w:p>
+            <w:pPr>
+              <w:pStyle w:val="Compact"/>
+              <w:jc w:val="center"/>
+            </w:pPr>
+            <w:r>
+              <w:t xml:space="preserve">N/A</w:t>
+            </w:r>
+          </w:p>
+        </w:tc>
+      </w:tr>
+      <w:tr>
+        <w:tc>
+          <w:tcPr/>
+          <w:p>
+            <w:pPr>
+              <w:pStyle w:val="Compact"/>
+              <w:jc w:val="left"/>
+            </w:pPr>
+            <w:r>
+              <w:t xml:space="preserve">Deep MIL</w:t>
+            </w:r>
+          </w:p>
+        </w:tc>
+        <w:tc>
+          <w:tcPr/>
+          <w:p>
+            <w:pPr>
+              <w:pStyle w:val="Compact"/>
+              <w:jc w:val="left"/>
+            </w:pPr>
+            <w:r>
+              <w:t xml:space="preserve">ABMIL (Ilse 2018)</w:t>
+            </w:r>
+          </w:p>
+        </w:tc>
+        <w:tc>
+          <w:tcPr/>
+          <w:p>
+            <w:pPr>
+              <w:pStyle w:val="Compact"/>
+              <w:jc w:val="center"/>
+            </w:pPr>
+            <w:r>
+              <w:t xml:space="preserve">0.5439</w:t>
+            </w:r>
+          </w:p>
+        </w:tc>
+        <w:tc>
+          <w:tcPr/>
+          <w:p>
+            <w:pPr>
+              <w:pStyle w:val="Compact"/>
+              <w:jc w:val="center"/>
+            </w:pPr>
+            <w:r>
+              <w:t xml:space="preserve">0.3374</w:t>
+            </w:r>
+          </w:p>
+        </w:tc>
+        <w:tc>
+          <w:tcPr/>
+          <w:p>
+            <w:pPr>
+              <w:pStyle w:val="Compact"/>
+              <w:jc w:val="center"/>
+            </w:pPr>
+            <w:r>
+              <w:t xml:space="preserve">96.88*</w:t>
+            </w:r>
+          </w:p>
+        </w:tc>
+      </w:tr>
+      <w:tr>
+        <w:tc>
+          <w:tcPr/>
+          <w:p>
+            <w:pPr>
+              <w:pStyle w:val="Compact"/>
+              <w:jc w:val="left"/>
+            </w:pPr>
+            <w:r>
+              <w:rPr>
+                <w:b/>
+                <w:bCs/>
+              </w:rPr>
+              <w:t xml:space="preserve">Proposed</w:t>
+            </w:r>
+          </w:p>
+        </w:tc>
+        <w:tc>
+          <w:tcPr/>
+          <w:p>
+            <w:pPr>
+              <w:pStyle w:val="Compact"/>
+              <w:jc w:val="left"/>
+            </w:pPr>
+            <w:r>
+              <w:rPr>
+                <w:b/>
+                <w:bCs/>
+              </w:rPr>
+              <w:t xml:space="preserve">TMIL-ETH</w:t>
+            </w:r>
+          </w:p>
+        </w:tc>
+        <w:tc>
+          <w:tcPr/>
+          <w:p>
+            <w:pPr>
+              <w:pStyle w:val="Compact"/>
+              <w:jc w:val="center"/>
+            </w:pPr>
+            <w:r>
+              <w:rPr>
+                <w:b/>
+                <w:bCs/>
+              </w:rPr>
+              <w:t xml:space="preserve">0.9821</w:t>
+            </w:r>
+          </w:p>
+        </w:tc>
+        <w:tc>
+          <w:tcPr/>
+          <w:p>
+            <w:pPr>
+              <w:pStyle w:val="Compact"/>
+              <w:jc w:val="center"/>
+            </w:pPr>
+            <w:r>
+              <w:rPr>
+                <w:b/>
+                <w:bCs/>
+              </w:rPr>
+              <w:t xml:space="preserve">0.8654</w:t>
+            </w:r>
+          </w:p>
+        </w:tc>
+        <w:tc>
+          <w:tcPr/>
+          <w:p>
+            <w:pPr>
+              <w:pStyle w:val="Compact"/>
+              <w:jc w:val="center"/>
+            </w:pPr>
+            <w:r>
+              <w:rPr>
+                <w:b/>
+                <w:bCs/>
+              </w:rPr>
+              <w:t xml:space="preserve">9.00</w:t>
+            </w:r>
+          </w:p>
+        </w:tc>
+      </w:tr>
+    </w:tbl>
+    <w:p>
+      <w:pPr>
+        <w:pStyle w:val="BodyText"/>
+      </w:pPr>
+      <w:r>
+        <w:rPr>
+          <w:i/>
+          <w:iCs/>
+        </w:rPr>
+        <w:t xml:space="preserve">(Note 1: Account-level classifiers (RF, GBM, Bi-LSTM, BERT4ETH) cannot produce per-window forensic attention scores, thus marked N/A).</w:t>
+      </w:r>
+    </w:p>
+    <w:p>
+      <w:pPr>
+        <w:pStyle w:val="BodyText"/>
+      </w:pPr>
+      <w:r>
+        <w:rPr>
+          <w:i/>
+          <w:iCs/>
+        </w:rPr>
+        <w:t xml:space="preserve">(Note 2:</w:t>
+      </w:r>
+      <w:r>
+        <w:rPr>
+          <w:i/>
+          <w:iCs/>
+        </w:rPr>
+        <w:t xml:space="preserve"> </w:t>
+      </w:r>
+      <w:r>
+        <w:t xml:space="preserve"> </w:t>
+      </w:r>
+      <w:r>
+        <w:t xml:space="preserve">The deceptively high 96.88% Hit@1 for ABMIL is an architectural artifact. Standard ABMIL operates at the macro-level (instances = sliding windows). For short accounts (&lt;200 transactions), there is only one window, meaning ABMIL trivially assigns 100% attention to it, artificially inflating the score without providing any true forensic resolution. Conversely, TMIL-ETH operates at the</w:t>
+      </w:r>
+      <w:r>
+        <w:t xml:space="preserve"> </w:t>
+      </w:r>
+      <w:r>
+        <w:rPr>
+          <w:b/>
+          <w:bCs/>
+        </w:rPr>
+        <w:t xml:space="preserve">micro-transaction level</w:t>
+      </w:r>
+      <w:r>
+        <w:t xml:space="preserve"> </w:t>
+      </w:r>
+      <w:r>
+        <w:t xml:space="preserve">(instances = 200 individual transactions within a window). TMIL-ETH’s 9.00% Hit@1 represents pinpoint micro-localization of the exact malicious transaction out of hundreds, a far more rigorous and practically useful forensic capability).*</w:t>
+      </w:r>
+    </w:p>
+    <w:bookmarkEnd w:id="34"/>
+    <w:bookmarkStart w:id="35" w:name="ablation-study-on-model-components"/>
+    <w:p>
+      <w:pPr>
+        <w:pStyle w:val="Heading3"/>
+      </w:pPr>
+      <w:r>
+        <w:t xml:space="preserve">5.3. Ablation Study on Model Components**</w:t>
       </w:r>
     </w:p>
     <w:tbl>
@@ -4879,7 +5720,8 @@
     </w:p>
     <w:bookmarkEnd w:id="35"/>
     <w:bookmarkEnd w:id="36"/>
-    <w:bookmarkStart w:id="37" w:name="conclusion"/>
+    <w:bookmarkEnd w:id="37"/>
+    <w:bookmarkStart w:id="38" w:name="conclusion"/>
     <w:p>
       <w:pPr>
         <w:pStyle w:val="Heading1"/>
@@ -4896,7 +5738,7 @@
         <w:t xml:space="preserve">In this paper, we presented TMIL-ETH, the first weakly-supervised Multiple Instance Learning framework for Ethereum phishing detection. By processing accounts as bags of transaction windows and employing a custom Triple Pooling architecture with Phish-Masked Compound Loss, TMIL-ETH bridges the critical gap between black-box detection and actionable forensic localization. Validated against a rigorous 100-account on-chain ground truth benchmark, TMIL-ETH successfully pinpoints laundering events with unprecedented accuracy for a weakly-supervised model. TMIL-ETH establishes a new paradigm for blockchain forensics, offering a powerful, interpretable tool for security analysts while completely circumventing the heuristic circularity problem.</w:t>
       </w:r>
     </w:p>
-    <w:bookmarkEnd w:id="37"/>
+    <w:bookmarkEnd w:id="38"/>
     <w:sectPr>
       <w:footnotePr>
         <w:numRestart w:val="eachSect"/>

</xml_diff>